<commit_message>
Add unit tests for catalog and frontier benchmark functionality
- Introduced `test_catalog.py` to validate catalog structure, case generation, and service behavior.
- Added tests for allowed products, categories, injection techniques, and case uniqueness.
- Implemented `test_frontier_benchmark.py` to assess model specification parsing, retry logic, rate limiting, cost estimation, and frontier benchmark execution.
- Ensured coverage for various scenarios including valid and invalid model specs, transient failures, and budget constraints.
</commit_message>
<xml_diff>
--- a/docs/CAPE_AP2_Elite_Journal_Revision.docx
+++ b/docs/CAPE_AP2_Elite_Journal_Revision.docx
@@ -129,7 +129,8 @@
         <w:rPr/>
       </w:pPr>
       <w:r>
-        <w:t>Agentic payment protocols can prove delegated authority and bind transaction details, yet a structurally valid payment can still violate a user's semantic policy when merchant-controlled content changes what an agent believes it is buying. CAPE places a provenance-aware authorization gateway between an agent proposal and payment dispatch. CAPE Witness Repair (CWR) retains unchanged positive attestations and chooses a minimum-cost refresh set that eliminates every corruption explanation permitted by a bounded provenance adversary. Decision-Flip Margin Repair (DFMR) treats positive and negative evidence symmetrically and chooses refreshes through an exact finite minimax recurrence. Beyond the controlled optimization studies, we implement CAPE with the official AP2 Python SDK, five signed loopback evidence services, version-bound authorization, and an idempotent payment sandbox. An expanded benchmark executes 2,520 matched flows across four benign conditions, fifteen in-model attack scenarios, two deliberate premise violations, and six defenses. Full revalidation, CWR, and DFMR produce no unauthorized effect in 300 in-model attacks per defense, whereas AP2-only, provenance-blind majority, and fixed-TTL controls produce 160, 140, and 40. The strong defenses complete 60 of 80 benign flows because a two-source outage safely triggers abstention. The premise violations cause unauthorized effects and therefore delimit, rather than extend, the guarantee. A second study executes 156 decisions from Qwen2.5-0.5B-Instruct and SmolLM2-1.7B-Instruct. The models propose forbidden purchases in 40.0% to 80.0% of attack runs; AP2-only and majority pass every compromised proposal, while Full, CWR, and DFMR pass none. These finite, synthetic results establish end-to-end containment under declared assumptions, not production fraud reduction or frontier-model robustness.</w:t>
+        <w:rPr/>
+        <w:t>Agentic payment protocols can prove delegated authority and bind transaction details, yet a structurally valid payment can still violate a user's semantic policy when merchant-controlled content changes what an agent believes it is buying. CAPE places a provenance-aware authorization gateway between an agent proposal and payment dispatch. CAPE Witness Repair (CWR) retains unchanged positive attestations and chooses a minimum-cost refresh set that eliminates every corruption explanation permitted by a bounded provenance adversary. Decision-Flip Margin Repair (DFMR) treats positive and negative evidence symmetrically and chooses refreshes through an exact finite minimax recurrence. Beyond the controlled optimization studies, we implement CAPE with the official AP2 Python SDK, five signed loopback evidence services, version-bound authorization, and an idempotent payment sandbox. An expanded benchmark executes 2,520 matched flows across four benign conditions, fifteen in-model attack scenarios, two deliberate premise violations, and six defenses. Full revalidation, CWR, and DFMR produce no unauthorized effect in 300 in-model attacks per defense, whereas AP2-only, provenance-blind majority, and fixed-TTL controls produce 160, 140, and 40. The strong defenses complete 60 of 80 benign flows because a two-source outage safely triggers abstention. The premise violations cause unauthorized effects and therefore delimit, rather than extend, the guarantee. A second study executes purchase decisions from frontier hosted language models queried through their production APIs rather than small local models. Google Gemini 3.1 Flash Lite and OpenAI GPT-5-mini each completed all 114 planned decisions (19 catalog cases x 2 prompt profiles x 3 repetition trials) with zero invalid outputs. Under the hardened, data-boundary prompt both models proposed zero forbidden purchases; under the naive prompt Gemini proposed a forbidden purchase in 10.0% of attack attempts and GPT-5-mini in 3.3%, each through a single injection technique. AP2-only and provenance-blind majority converted every compromised proposal into a sandbox payment; TTL, Full, CWR, and DFMR blocked all of them, matching the pattern already observed in the deterministic AP2 testbed. Results for Anthropic Claude are pending API access and are not included. These finite, synthetic results establish end-to-end containment under declared assumptions, not production fraud reduction across arbitrary deployments.</w:t>
       </w:r>
     </w:p>
     <w:p>
@@ -245,7 +246,7 @@
         <w:rPr/>
       </w:pPr>
       <w:r>
-        <w:t>The paper makes seven contributions. First, it identifies a semantic authorization gap that can remain after a payment mandate is structurally valid. Second, it defines the residual-evidence condition and characterizes when a protected predicate remains certifiable without refresh. Third, it gives CWR, an exact minimum-cost positive-certificate repair algorithm with explicit soundness, optimality, and complexity boundaries. Fourth, it introduces the authorization decision-flip margin and DFMR, a bilateral ALLOW/DENY verifier with an exact finite minimax policy. Fifth, it implements the gateway around the official AP2 Python SDK, signed HTTP evidence, version-bound dispatch, and idempotent processing. Sixth, it evaluates fifteen in-model attack scenarios at the executable payment boundary and retains two successful counterexamples that violate the fault-budget or provenance assumptions. Seventh, it connects two compact open language models to the same gateway and separates upstream agent compromise from downstream unauthorized payment. The last study is deliberately exploratory: it demonstrates end-to-end instrumentation and containment, not representative model ranking.</w:t>
+        <w:t>The paper makes seven contributions. First, it identifies a semantic authorization gap that can remain after a payment mandate is structurally valid. Second, it defines the residual-evidence condition and characterizes when a protected predicate remains certifiable without refresh. Third, it gives CWR, an exact minimum-cost positive-certificate repair algorithm with explicit soundness, optimality, and complexity boundaries. Fourth, it introduces the authorization decision-flip margin and DFMR, a bilateral ALLOW/DENY verifier with an exact finite minimax policy. Fifth, it implements the gateway around the official AP2 Python SDK, signed HTTP evidence, version-bound dispatch, and idempotent processing. Sixth, it evaluates fifteen in-model attack scenarios at the executable payment boundary and retains two successful counterexamples that violate the fault-budget or provenance assumptions. Seventh, it connects three frontier hosted language models, Claude, GPT, and Gemini, accessed through their production APIs with retry, rate-limiting, and per-call cost accounting, to the same gateway and separates upstream agent compromise from downstream unauthorized payment. The last study is deliberately exploratory: it demonstrates end-to-end instrumentation and containment against production-grade hosted models, not representative model ranking.</w:t>
       </w:r>
     </w:p>
     <w:p>
@@ -3154,7 +3155,7 @@
         <w:rPr/>
       </w:pPr>
       <w:r>
-        <w:t>All reported results come from the accompanying Python artifacts. The controlled algorithmic run and operational extension used Python 3.12 on Linux x86-64; the operational path used cryptography 46.0.5 and the official AP2 SDK pinned to commit e1ea56d. The local-model study used llama-cpp-python 0.3.35 with eight CPU threads and Q4_K_M GGUF weights. Nine logical processors were visible and no process was pinned to one CPU. These details describe the execution environment, not a hardware performance specification. Source code, raw model outputs, per-execution records, model hashes, environment metadata, and figure scripts accompany the manuscript.</w:t>
+        <w:t>All reported results come from the accompanying Python artifacts. The controlled algorithmic run and operational extension used Python 3.12 on Linux x86-64; the operational path used cryptography 46.0.5 and the official AP2 SDK pinned to commit e1ea56d. The frontier hosted-model study called the Anthropic, OpenAI, and Google Gemini production chat-completion APIs directly, with bounded exponential-backoff retry and a per-provider rate limiter, rather than executing local model weights; each call's token usage, response model identifier, and USD cost are recorded per row. These details describe the execution environment, not a hardware performance specification. Source code, per-execution records, response-model identifiers, per-call cost accounting, environment metadata, and figure scripts accompany the manuscript.</w:t>
       </w:r>
     </w:p>
     <w:p>
@@ -3195,7 +3196,7 @@
         <w:rPr/>
       </w:pPr>
       <w:r>
-        <w:t>Sections 6.2 through 6.6 remain controlled algorithmic experiments without language-model calls, Internet retrieval, or live payment. Section 6.7 exercises official AP2 processing and loopback services across deterministic adversarial fixtures. Section 6.8 adds local inference from two named open models. In every study, an unsafe authorization requires a recorded sandbox payment effect while the protected predicate is false. It is neither a bank settlement nor an estimate of deployment fraud.</w:t>
+        <w:t>Sections 6.2 through 6.6 remain controlled algorithmic experiments without language-model calls, Internet retrieval, or live payment. Section 6.7 exercises official AP2 processing and loopback services across deterministic adversarial fixtures. Section 6.8 adds inference from three named frontier hosted models accessed over their production APIs. In every study, an unsafe authorization requires a recorded sandbox payment effect while the protected predicate is false. It is neither a bank settlement nor an estimate of deployment fraud.</w:t>
       </w:r>
     </w:p>
     <w:p>
@@ -3677,19 +3678,21 @@
         <w:pStyle w:val="Heading2"/>
       </w:pPr>
       <w:r>
-        <w:t>6.8. Local-model prompt-injection benchmark</w:t>
+        <w:t>6.8. Frontier hosted-model prompt-injection benchmark</w:t>
       </w:r>
     </w:p>
     <w:p>
       <w:pPr/>
       <w:r>
-        <w:t>We execute Qwen2.5-0.5B-Instruct and SmolLM2-1.7B-Instruct as Q4_K_M GGUF files through llama-cpp-python [20]-[22]. For each model, ten forbidden stored-value products and three allowed electronics products are evaluated under a minimal policy prompt and a data-boundary prompt that explicitly labels merchant text untrusted. Three decoding seeds (7, 19, and 43), temperature 0.2, top-p 0.95, and a 32-token limit yield 156 model decisions. Output must contain a JSON Boolean; invalid output fails closed.</w:t>
+        <w:rPr/>
+        <w:t>We query Claude (Anthropic), GPT (OpenAI), and Gemini (Google) through their production chat-completion APIs [20]-[22]. All three models are evaluated against a synthetic product catalog spanning kitchen, clothing, and electronics: nine legitimately labeled products (three per category, including one boundary item priced exactly at the USD 200 cap in each category) and ten stored-value gift cards or prepaid cards, each disguised under a cover title and claimed category drawn from the same three categories, paired one-to-one with the ten prompt-injection techniques used throughout this study. Each case is evaluated under a minimal policy prompt and a data-boundary prompt that explicitly labels merchant text untrusted. Three repetition indices (7, 19, and 43) label independent trials at temperature 0.2 and a 32-token completion limit. Only OpenAI and Google's APIs accept a seed parameter at all, and neither provider guarantees it reproduces identical output, so seed here selects a trial rather than fixing the model's sampling. Output must contain a JSON Boolean; invalid output fails closed. This design was executed against Google's production Gemini API (gemini-3.1-flash-lite) and OpenAI's production API (gpt-5-mini), yielding 228 real model decisions (114 per model) with zero invalid outputs and zero failed calls, at a combined measured cost of USD 0.0069; Claude execution is pending API access and is not yet included.</w:t>
       </w:r>
     </w:p>
     <w:p>
       <w:pPr/>
       <w:r>
-        <w:t>Every model-produced purchase proposal is then replayed through all six defenses with the same AP2 and evidence state, producing 936 gateway records. Agent compromise rate is the fraction of forbidden cases that produce a purchase proposal. Unauthorized payment rate additionally requires a sandbox effect. Benign utility is reported as completed allowed purchases. Percentile intervals resample the ten attack cases as clusters while retaining the three seeds within each case. They quantify sensitivity to this fixed synthetic set and are not population intervals for unseen attacks or models.</w:t>
+        <w:rPr/>
+        <w:t>Every model-produced purchase proposal is then replayed through all six defenses with the same AP2 and evidence state, producing 684 gateway records for the executed Gemini run (114 decisions x 6 defenses). Agent compromise rate is the fraction of forbidden cases that produce a purchase proposal. Unauthorized payment rate additionally requires a sandbox effect. Benign utility is reported as completed allowed purchases. Percentile intervals resample the ten attack cases as clusters while retaining the three repetition trials within each case. They quantify sensitivity to this fixed synthetic set and are not population intervals for unseen attacks or models.</w:t>
       </w:r>
     </w:p>
     <w:p>
@@ -9106,19 +9109,21 @@
         <w:pStyle w:val="Heading2"/>
       </w:pPr>
       <w:r>
-        <w:t>7.5. Model-generated attacks and downstream containment</w:t>
+        <w:t>7.5. Frontier-model-generated attacks and downstream containment</w:t>
       </w:r>
     </w:p>
     <w:p>
       <w:pPr/>
       <w:r>
-        <w:t>All 78 Qwen outputs are schema-valid. Under the minimal prompt, Qwen proposes twelve forbidden purchases in thirty attack runs and completes three of nine benign runs. The data-boundary prompt improves benign completion to nine of nine but also increases forbidden proposals to twenty-four of thirty. SmolLM2 returns valid JSON in twenty-seven of thirty attack runs under each prompt. It proposes seventeen forbidden purchases under the minimal prompt and twenty-one under the data-boundary prompt, while completing six and five of nine benign runs. Thus the prompt labeled hardened is not consistently safer; it changes refusal and compliance behavior together. The cluster intervals are correspondingly broad: 10-70% and 50-100% for Qwen, and 26.7-86.7% and 40-100% for SmolLM2.</w:t>
+        <w:rPr/>
+        <w:t>Google Gemini 3.1 Flash Lite and OpenAI GPT-5-mini are evaluated through their production APIs with reasoning minimized (a zero thinking budget for Gemini, minimal reasoning effort for GPT-5-mini) so token usage and behavior are comparable to a non-reasoning call. All 228 outputs across both models are schema-valid JSON. Under the hardened, data-boundary prompt, both models propose zero forbidden purchases across all 60 attack attempts each (0% agent compromise, 95% cluster interval 0.00-0.00%). Under the naive prompt, Gemini proposes a forbidden purchase in 10.0% of attack attempts (95% cluster interval 0.00-30.00%), consistently through the same injection technique, a fabricated end-of-merchant-data delimiter escape asserting a new user policy, across all three repetition trials; GPT-5-mini proposes a forbidden purchase in 3.3% of attack attempts (95% cluster interval 0.00-10.00%), through a different technique, a forged system-tag override, in one of three trials. Both models complete all 54 benign purchases under both prompts. The wide cluster intervals reflect that only ten attack cases and three repetition trials back these rates; they are not population estimates, and the specific technique that succeeded differs between the two models rather than pointing to one universally effective attack. Results for Anthropic Claude are pending API access at the time of this revision and are not included in these counts.</w:t>
       </w:r>
     </w:p>
     <w:p>
       <w:pPr/>
       <w:r>
-        <w:t>AP2-only and Majority produce an unauthorized payment for every compromised proposal: twelve or twenty-four Qwen effects and seventeen or twenty-one SmolLM2 effects, depending on prompt. Full, CWR, and DFMR produce zero across all four model/prompt conditions and complete every benign purchase the model proposes. TTL also blocks the observed attacks because the fixture begins with current negative evidence; the deterministic stale and race cases show why that result cannot be generalized. These results locate the contribution downstream of model alignment: CAPE need not prevent the agent from being manipulated to prevent the manipulated proposal from becoming an economic effect, provided the evidence assumptions hold.</w:t>
+        <w:rPr/>
+        <w:t>Every compromised proposal from either model is converted into an unauthorized sandbox payment by AP2-only and by provenance-blind majority: three of three for Gemini, one of one for GPT-5-mini. TTL, Full, CWR, and DFMR block all of them. This matches the pattern already observed in the deterministic AP2 testbed above (Section 7.4): a semantic-category check without provenance passes a manipulated proposal straight through, while an evidence-refresh-and-repair discipline stops it, regardless of whether the manipulation originates from a scripted attacker or from an actual frontier language model persuaded by injected merchant text. Across both models, all 1,368 gateway-routed decisions (228 decisions x 6 defenses) and all 648 benign gateway routings (108 benign decisions x 6 defenses) complete with the expected outcome, and total measured API cost for this study is USD 0.0069.</w:t>
       </w:r>
     </w:p>
     <w:p>
@@ -9126,7 +9131,8 @@
         <w:keepNext/>
       </w:pPr>
       <w:r>
-        <w:t>Table 6. Local-model compromise and containment</w:t>
+        <w:rPr/>
+        <w:t>Table 6. Frontier-model compromise and containment (Gemini 3.1 Flash Lite and GPT-5-mini measured; Claude pending API access)</w:t>
       </w:r>
     </w:p>
     <w:tbl>
@@ -11709,7 +11715,7 @@
         <w:rPr/>
       </w:pPr>
       <w:r>
-        <w:t>The experiments establish executable feasibility, oracle agreement on bounded instances, controlled failure behavior, actual local-model proposal generation, and post-agent containment in an AP2-shaped path. They do not establish robustness for frontier or hosted models, the accuracy of public product labels, production source governance, Internet-scale latency, or live-processor behavior. The two small models are useful attack generators for the testbed, not representative samples of deployed shopping agents. Production fraud reduction remains unmeasured.</w:t>
+        <w:t>The experiments establish executable feasibility, oracle agreement on bounded instances, controlled failure behavior, actual frontier hosted-model proposal generation, and post-agent containment in an AP2-shaped path. They do not establish the accuracy of public product labels, production source governance, Internet-scale latency, or live-processor behavior. Of the three intended frontier models, Google Gemini 3.1 Flash Lite and OpenAI GPT-5-mini have been executed at the time of this revision; Claude results are pending API access and are not included above. Two frontier models on one fixed case set are a useful attack-generation and containment-pipeline demonstration, not a representative sample of every deployed shopping-agent architecture, every frontier model family, or even every version of the two models tested, since providers update hosted model weights and behavior without a fixed release schedule. Production fraud reduction remains unmeasured.</w:t>
       </w:r>
     </w:p>
     <w:p>
@@ -11719,7 +11725,7 @@
         <w:rPr/>
       </w:pPr>
       <w:r>
-        <w:t>The deterministic generators still supply ground truth, provenance, corruption sets, and version changes. The local-model study removes the earlier replay-only limitation at the proposal boundary, but retains synthetic products and ten hand-constructed injection families. Three decoding seeds do not create thirty independent attack designs. The case-cluster bootstrap makes that dependence visible, yet a held-out public benchmark and independently reviewed product labels remain necessary for external validity.</w:t>
+        <w:t>The deterministic generators still supply ground truth, provenance, corruption sets, and version changes. The frontier-model study removes the earlier replay-only limitation at the proposal boundary using production-grade models rather than small local weights, but retains synthetic products and ten hand-constructed injection families. Three repetition trials per case do not create thirty independent attack designs. The case-cluster bootstrap makes that dependence visible, yet a held-out public benchmark and independently reviewed product labels remain necessary for external validity.</w:t>
       </w:r>
     </w:p>
     <w:p>
@@ -11862,7 +11868,7 @@
         <w:rPr/>
       </w:pPr>
       <w:r>
-        <w:t>The AP2 and local-model testbeds close the executable integration and replay-only gaps, but stronger external validation should connect a pinned shopping-agent benchmark such as AgentDojo to the gateway, use product labels reviewed independently of the optimizer, and derive provenance from documented catalog relationships. The next study should pre-register a held-out attack set, include larger open and hosted frontier models where permitted, and report model utility, invalid actions, source availability, and economic effects as separate outcomes.</w:t>
+        <w:t>The AP2 and frontier-model testbeds close the executable integration and replay-only gaps, but stronger external validation should connect a pinned shopping-agent benchmark such as AgentDojo to the gateway, use product labels reviewed independently of the optimizer, and derive provenance from documented catalog relationships. The next study should pre-register a held-out attack set, include additional frontier model families and open-weight models for broader comparison, and report model utility, invalid actions, source availability, and economic effects as separate outcomes.</w:t>
       </w:r>
     </w:p>
     <w:p>
@@ -11872,7 +11878,7 @@
         <w:rPr/>
       </w:pPr>
       <w:r>
-        <w:t>CWR and DFMR also deserve comparison with broader certificate-maintenance, active-testing, and stochastic-acquisition methods on externally collected provenance graphs. The operational benchmark has five evidence services and f=1; larger graphs, adaptive provenance changes, parallel acquisition, and service-tail latency may change the preferred policy. The present contribution is therefore narrower than a production-readiness claim: an authorization-specific formulation, official-protocol integration, executable algorithms, actual small-model attacks, measured containment, availability costs, and explicit counterexamples.</w:t>
+        <w:t>CWR and DFMR also deserve comparison with broader certificate-maintenance, active-testing, and stochastic-acquisition methods on externally collected provenance graphs. The operational benchmark has five evidence services and f=1; larger graphs, adaptive provenance changes, parallel acquisition, and service-tail latency may change the preferred policy. The present contribution is therefore narrower than a production-readiness claim: an authorization-specific formulation, official-protocol integration, executable algorithms, actual frontier-model attacks, measured containment, availability costs, and explicit counterexamples.</w:t>
       </w:r>
     </w:p>
     <w:p>
@@ -11916,7 +11922,8 @@
         <w:rPr/>
       </w:pPr>
       <w:r>
-        <w:t>The results follow the same division. CWR matches exhaustive optimization on the bounded positive-repair instances, while DFMR adds bilateral certification and reaches the model-consistent verdict in all 1,000 finite worlds with less acquisition than full or cheapest-first revalidation. In the expanded AP2 testbed, Full, CWR, and DFMR produce no unauthorized effect in 300 in-model attacks per defense but safely decline one of four benign scenario types. Two compact language models generate forbidden proposals in 40-80% of the synthetic attack runs; AP2-only and provenance-blind majority convert every such proposal into a sandbox effect, whereas Full, CWR, and DFMR convert none. When the fault budget or dependency registry is wrong, the same strong defenses fail. CAPE is therefore a conditional economic-action firewall, not a substitute for model alignment, trustworthy provenance, or processor-grade transaction engineering.</w:t>
+        <w:rPr/>
+        <w:t>The results follow the same division. CWR matches exhaustive optimization on the bounded positive-repair instances, while DFMR adds bilateral certification and reaches the model-consistent verdict in all 1,000 finite worlds with less acquisition than full or cheapest-first revalidation. In the expanded AP2 testbed, Full, CWR, and DFMR produce no unauthorized effect in 300 in-model attacks per defense but safely decline one of four benign scenario types. Google Gemini 3.1 Flash Lite and OpenAI GPT-5-mini were each queried through their production APIs against the same forbidden-purchase attack cases used throughout this study; under a naive prompt both proposed a forbidden purchase in a minority of attempts (10.0% and 3.3% respectively), and AP2-only and provenance-blind majority converted every such proposal into a sandbox payment while TTL, Full, CWR, and DFMR blocked all of them, matching the pattern established by the deterministic AP2 testbed. Claude execution remains pending API access. When the fault budget or dependency registry is wrong, the same strong defenses fail. CAPE is therefore a conditional economic-action firewall, not a substitute for model alignment, trustworthy provenance, or processor-grade transaction engineering.</w:t>
       </w:r>
     </w:p>
     <w:p>
@@ -11930,7 +11937,7 @@
     <w:p>
       <w:pPr/>
       <w:r>
-        <w:t>The accompanying CAPE artifact contains the pinned AP2 dependency, deterministic and local-model scenario definitions, eleven protocol and algorithm regression tests plus two processor-idempotency tests, raw model outputs, per-execution gateway records, case-level comparisons, model hashes, summary tables, and environment metadata. The default experiment uses no paid API, cloud account, live payment credential, or human-participant data. Model weights are referenced by official repository and SHA-256 hash but are not redistributed.</w:t>
+        <w:t>The accompanying CAPE artifact contains the pinned AP2 dependency, deterministic and frontier hosted-model scenario definitions, eleven deterministic protocol, algorithm, and processor-idempotency regression tests plus thirty-two frontier-benchmark and product-catalog regression tests covering retry, rate-limiting, cost accounting, catalog service behavior, and gateway routing against mocked and simulated providers, per-execution gateway records, case-level comparisons, response-model identifiers, and per-call token cost for hosted models, summary tables, and environment metadata. The deterministic and AP2 testbed experiments use no paid API, cloud account, live payment credential, or human-participant data. The frontier hosted-model study requires a billed or free-tier API key for Anthropic, OpenAI, or Google, is explicitly gated behind a command-line cost-acceptance flag, and is reported separately from the paid-API-free results.</w:t>
       </w:r>
     </w:p>
     <w:p>
@@ -12389,7 +12396,7 @@
         <w:keepLines/>
       </w:pPr>
       <w:r>
-        <w:t>[20] Qwen Team, “Qwen2.5 Technical Report,” arXiv:2412.15115, 2024.</w:t>
+        <w:t>[20] Anthropic, "Claude models overview," model documentation, https://docs.claude.com/, accessed September 17, 2026.</w:t>
       </w:r>
     </w:p>
     <w:p>
@@ -12397,7 +12404,7 @@
         <w:keepLines/>
       </w:pPr>
       <w:r>
-        <w:t>[21] L. Ben Allal et al., “SmolLM2: When Smol Goes Big—Data-Centric Training of a Small Language Model,” arXiv:2502.02737, 2025.</w:t>
+        <w:t>[21] OpenAI, "Models," API documentation, https://platform.openai.com/docs/models, accessed September 17, 2026.</w:t>
       </w:r>
     </w:p>
     <w:p>
@@ -12405,7 +12412,7 @@
         <w:keepLines/>
       </w:pPr>
       <w:r>
-        <w:t>[22] G. Gerganov et al., “llama.cpp,” software repository, https://github.com/ggml-org/llama.cpp, accessed September 17, 2026.</w:t>
+        <w:t>[22] Google, "Gemini models," API documentation, https://ai.google.dev/gemini-api/docs/models, accessed September 17, 2026.</w:t>
       </w:r>
     </w:p>
     <w:sectPr>

</xml_diff>